<commit_message>
Add BJT and MOSFET
</commit_message>
<xml_diff>
--- a/Lab1/LELA1_LAB1_Rah_Sal.docx
+++ b/Lab1/LELA1_LAB1_Rah_Sal.docx
@@ -2371,15 +2371,22 @@
         <w:rPr>
           <w:rFonts w:ascii="Calibri" w:hAnsi="Calibri"/>
         </w:rPr>
-        <w:t xml:space="preserve"> CH1 – sygnał z generatora, CH2 – napięcie na kolektorze tranzystora T1</w:t>
-      </w:r>
-    </w:p>
-    <w:p>
-      <w:pPr>
-        <w:rPr>
-          <w:rFonts w:ascii="Calibri" w:hAnsi="Calibri"/>
-        </w:rPr>
-      </w:pPr>
+        <w:t xml:space="preserve"> </w:t>
+      </w:r>
+    </w:p>
+    <w:p>
+      <w:pPr>
+        <w:jc w:val="center"/>
+        <w:rPr>
+          <w:rFonts w:ascii="Calibri" w:hAnsi="Calibri"/>
+        </w:rPr>
+      </w:pPr>
+      <w:r>
+        <w:rPr>
+          <w:rFonts w:ascii="Calibri" w:hAnsi="Calibri"/>
+        </w:rPr>
+        <w:t>CH1 – sygnał z generatora, CH2 – napięcie na kolektorze tranzystora T1</w:t>
+      </w:r>
     </w:p>
     <w:p>
       <w:pPr>
@@ -5243,6 +5250,20 @@
           <w:iCs/>
         </w:rPr>
       </w:pPr>
+      <w:r>
+        <w:rPr>
+          <w:rFonts w:ascii="Calibri" w:hAnsi="Calibri"/>
+          <w:iCs/>
+        </w:rPr>
+        <w:t>Proje</w:t>
+      </w:r>
+      <w:r>
+        <w:rPr>
+          <w:rFonts w:ascii="Calibri" w:hAnsi="Calibri"/>
+          <w:iCs/>
+        </w:rPr>
+        <w:t>ktując klucz na bipolarnym tranzystorze musimy zapewnić odpowiedni prąd bazy tak, aby</w:t>
+      </w:r>
     </w:p>
     <w:p>
       <w:pPr>
@@ -5298,14 +5319,70 @@
           <w:rFonts w:ascii="Calibri" w:hAnsi="Calibri"/>
           <w:iCs/>
         </w:rPr>
-        <w:t>Proje</w:t>
+        <w:t>t</w:t>
       </w:r>
       <w:r>
         <w:rPr>
           <w:rFonts w:ascii="Calibri" w:hAnsi="Calibri"/>
           <w:iCs/>
         </w:rPr>
-        <w:t>ktując klucz na bipolarnym tranzystorze musimy zapewnić odpowiedni prąd bazy tak, aby</w:t>
+        <w:t>ranzys</w:t>
+      </w:r>
+      <w:r>
+        <w:rPr>
+          <w:rFonts w:ascii="Calibri" w:hAnsi="Calibri"/>
+          <w:iCs/>
+        </w:rPr>
+        <w:t xml:space="preserve">tor </w:t>
+      </w:r>
+      <w:r>
+        <w:rPr>
+          <w:rFonts w:ascii="Calibri" w:hAnsi="Calibri"/>
+          <w:iCs/>
+        </w:rPr>
+        <w:t>znajdował się w stanie nasycenia. Jednak prąd ten nie</w:t>
+      </w:r>
+      <w:r>
+        <w:rPr>
+          <w:rFonts w:ascii="Calibri" w:hAnsi="Calibri"/>
+          <w:iCs/>
+        </w:rPr>
+        <w:t xml:space="preserve"> może byd zbyt wysoki, gdyż im tranzystor głębiej nasycony</w:t>
+      </w:r>
+      <w:r>
+        <w:rPr>
+          <w:rFonts w:ascii="Calibri" w:hAnsi="Calibri"/>
+          <w:iCs/>
+        </w:rPr>
+        <w:t xml:space="preserve"> tym</w:t>
+      </w:r>
+      <w:r>
+        <w:rPr>
+          <w:rFonts w:ascii="Calibri" w:hAnsi="Calibri"/>
+          <w:iCs/>
+        </w:rPr>
+        <w:t xml:space="preserve"> wczesniej zaczynają</w:t>
+      </w:r>
+      <w:r>
+        <w:rPr>
+          <w:rFonts w:ascii="Calibri" w:hAnsi="Calibri"/>
+          <w:iCs/>
+        </w:rPr>
+        <w:t xml:space="preserve"> </w:t>
+      </w:r>
+      <w:r>
+        <w:rPr>
+          <w:rFonts w:ascii="Calibri" w:hAnsi="Calibri"/>
+          <w:iCs/>
+        </w:rPr>
+        <w:t>występowąć opóźnienia w rozwieraniu</w:t>
+      </w:r>
+      <w:r>
+        <w:rPr>
+          <w:rFonts w:ascii="Calibri" w:hAnsi="Calibri"/>
+          <w:iCs/>
+        </w:rPr>
+        <w:t xml:space="preserve"> klucza. </w:t>
       </w:r>
     </w:p>
     <w:p>
@@ -5354,112 +5431,6 @@
         </w:tabs>
         <w:rPr>
           <w:rFonts w:ascii="Calibri" w:hAnsi="Calibri"/>
-          <w:iCs/>
-        </w:rPr>
-      </w:pPr>
-      <w:r>
-        <w:rPr>
-          <w:rFonts w:ascii="Calibri" w:hAnsi="Calibri"/>
-          <w:iCs/>
-        </w:rPr>
-        <w:t>t</w:t>
-      </w:r>
-      <w:r>
-        <w:rPr>
-          <w:rFonts w:ascii="Calibri" w:hAnsi="Calibri"/>
-          <w:iCs/>
-        </w:rPr>
-        <w:t>ranzys</w:t>
-      </w:r>
-      <w:r>
-        <w:rPr>
-          <w:rFonts w:ascii="Calibri" w:hAnsi="Calibri"/>
-          <w:iCs/>
-        </w:rPr>
-        <w:t xml:space="preserve">tor </w:t>
-      </w:r>
-      <w:r>
-        <w:rPr>
-          <w:rFonts w:ascii="Calibri" w:hAnsi="Calibri"/>
-          <w:iCs/>
-        </w:rPr>
-        <w:t>znajdował się w stanie nasycenia. Jednak prąd ten nie</w:t>
-      </w:r>
-      <w:r>
-        <w:rPr>
-          <w:rFonts w:ascii="Calibri" w:hAnsi="Calibri"/>
-          <w:iCs/>
-        </w:rPr>
-        <w:t xml:space="preserve"> może byd zbyt wysoki, gdyż im tranzystor głębiej nasycony wczesniej zaczynają</w:t>
-      </w:r>
-      <w:r>
-        <w:rPr>
-          <w:rFonts w:ascii="Calibri" w:hAnsi="Calibri"/>
-          <w:iCs/>
-        </w:rPr>
-        <w:t xml:space="preserve"> </w:t>
-      </w:r>
-      <w:r>
-        <w:rPr>
-          <w:rFonts w:ascii="Calibri" w:hAnsi="Calibri"/>
-          <w:iCs/>
-        </w:rPr>
-        <w:t>występowąć opóźnienia w rozwieraniu</w:t>
-      </w:r>
-      <w:r>
-        <w:rPr>
-          <w:rFonts w:ascii="Calibri" w:hAnsi="Calibri"/>
-          <w:iCs/>
-        </w:rPr>
-        <w:t xml:space="preserve"> klucza. </w:t>
-      </w:r>
-    </w:p>
-    <w:p>
-      <w:pPr>
-        <w:tabs>
-          <w:tab w:val="left" w:pos="0"/>
-          <w:tab w:val="left" w:pos="709"/>
-          <w:tab w:val="left" w:pos="1418"/>
-          <w:tab w:val="left" w:pos="2127"/>
-          <w:tab w:val="left" w:pos="2836"/>
-          <w:tab w:val="left" w:pos="3546"/>
-          <w:tab w:val="left" w:pos="4255"/>
-          <w:tab w:val="left" w:pos="4964"/>
-          <w:tab w:val="left" w:pos="5673"/>
-          <w:tab w:val="left" w:pos="6382"/>
-          <w:tab w:val="left" w:pos="7092"/>
-          <w:tab w:val="left" w:pos="7801"/>
-          <w:tab w:val="left" w:pos="8510"/>
-          <w:tab w:val="left" w:pos="9219"/>
-          <w:tab w:val="left" w:pos="9928"/>
-          <w:tab w:val="left" w:pos="10638"/>
-          <w:tab w:val="left" w:pos="11347"/>
-          <w:tab w:val="left" w:pos="12056"/>
-          <w:tab w:val="left" w:pos="12765"/>
-          <w:tab w:val="left" w:pos="13474"/>
-          <w:tab w:val="left" w:pos="14184"/>
-          <w:tab w:val="left" w:pos="14893"/>
-          <w:tab w:val="left" w:pos="15602"/>
-          <w:tab w:val="left" w:pos="16311"/>
-          <w:tab w:val="left" w:pos="17020"/>
-          <w:tab w:val="left" w:pos="17730"/>
-          <w:tab w:val="left" w:pos="18439"/>
-          <w:tab w:val="left" w:pos="19148"/>
-          <w:tab w:val="left" w:pos="19857"/>
-          <w:tab w:val="left" w:pos="20566"/>
-          <w:tab w:val="left" w:pos="21276"/>
-          <w:tab w:val="left" w:pos="21985"/>
-          <w:tab w:val="left" w:pos="22694"/>
-          <w:tab w:val="left" w:pos="23403"/>
-          <w:tab w:val="left" w:pos="24112"/>
-          <w:tab w:val="left" w:pos="24822"/>
-          <w:tab w:val="left" w:pos="25531"/>
-          <w:tab w:val="left" w:pos="26240"/>
-          <w:tab w:val="left" w:pos="26949"/>
-          <w:tab w:val="left" w:pos="27658"/>
-        </w:tabs>
-        <w:rPr>
-          <w:rFonts w:ascii="Calibri" w:hAnsi="Calibri"/>
           <w:i/>
           <w:iCs/>
           <w:lang w:bidi="ar-SA"/>
@@ -5534,7 +5505,103 @@
         <w:tabs>
           <w:tab w:val="left" w:pos="288"/>
         </w:tabs>
-        <w:jc w:val="both"/>
+        <w:jc w:val="center"/>
+        <w:rPr>
+          <w:rFonts w:ascii="Calibri" w:hAnsi="Calibri"/>
+          <w:b/>
+          <w:bCs/>
+          <w:color w:val="000000"/>
+          <w:lang w:bidi="ar-SA"/>
+        </w:rPr>
+      </w:pPr>
+      <w:r>
+        <w:rPr>
+          <w:rFonts w:ascii="Calibri" w:hAnsi="Calibri"/>
+          <w:b/>
+          <w:bCs/>
+          <w:noProof/>
+          <w:color w:val="000000"/>
+          <w:lang w:val="ru-RU" w:eastAsia="ru-RU" w:bidi="ar-SA"/>
+        </w:rPr>
+        <w:drawing>
+          <wp:inline distT="0" distB="0" distL="0" distR="0" wp14:anchorId="48E4F9D1" wp14:editId="53217E47">
+            <wp:extent cx="1329267" cy="1429969"/>
+            <wp:effectExtent l="0" t="0" r="4445" b="0"/>
+            <wp:docPr id="6" name="Рисунок 6"/>
+            <wp:cNvGraphicFramePr>
+              <a:graphicFrameLocks xmlns:a="http://schemas.openxmlformats.org/drawingml/2006/main" noChangeAspect="1"/>
+            </wp:cNvGraphicFramePr>
+            <a:graphic xmlns:a="http://schemas.openxmlformats.org/drawingml/2006/main">
+              <a:graphicData uri="http://schemas.openxmlformats.org/drawingml/2006/picture">
+                <pic:pic xmlns:pic="http://schemas.openxmlformats.org/drawingml/2006/picture">
+                  <pic:nvPicPr>
+                    <pic:cNvPr id="1" name=""/>
+                    <pic:cNvPicPr/>
+                  </pic:nvPicPr>
+                  <pic:blipFill>
+                    <a:blip r:embed="rId16"/>
+                    <a:stretch>
+                      <a:fillRect/>
+                    </a:stretch>
+                  </pic:blipFill>
+                  <pic:spPr>
+                    <a:xfrm>
+                      <a:off x="0" y="0"/>
+                      <a:ext cx="1334313" cy="1435397"/>
+                    </a:xfrm>
+                    <a:prstGeom prst="rect">
+                      <a:avLst/>
+                    </a:prstGeom>
+                  </pic:spPr>
+                </pic:pic>
+              </a:graphicData>
+            </a:graphic>
+          </wp:inline>
+        </w:drawing>
+      </w:r>
+    </w:p>
+    <w:p>
+      <w:pPr>
+        <w:jc w:val="center"/>
+        <w:rPr>
+          <w:rFonts w:ascii="Calibri" w:hAnsi="Calibri"/>
+        </w:rPr>
+      </w:pPr>
+      <w:r>
+        <w:rPr>
+          <w:rFonts w:ascii="Calibri" w:hAnsi="Calibri"/>
+          <w:bCs/>
+          <w:color w:val="000000"/>
+          <w:lang w:bidi="ar-SA"/>
+        </w:rPr>
+        <w:t xml:space="preserve">Rys. 2.1. </w:t>
+      </w:r>
+      <w:r>
+        <w:rPr>
+          <w:rFonts w:ascii="Calibri" w:hAnsi="Calibri"/>
+        </w:rPr>
+        <w:t>S</w:t>
+      </w:r>
+      <w:r>
+        <w:rPr>
+          <w:rFonts w:ascii="Calibri" w:hAnsi="Calibri"/>
+        </w:rPr>
+        <w:t>chemat ideowy klucza unipolarnego z „diopornikiem”</w:t>
+      </w:r>
+    </w:p>
+    <w:p>
+      <w:pPr>
+        <w:jc w:val="center"/>
+        <w:rPr>
+          <w:rFonts w:ascii="Calibri" w:hAnsi="Calibri"/>
+        </w:rPr>
+      </w:pPr>
+    </w:p>
+    <w:p>
+      <w:pPr>
+        <w:tabs>
+          <w:tab w:val="left" w:pos="288"/>
+        </w:tabs>
         <w:rPr>
           <w:rFonts w:ascii="Calibri" w:hAnsi="Calibri"/>
           <w:color w:val="000000"/>
@@ -5582,7 +5649,7 @@
                     </pic:cNvPicPr>
                   </pic:nvPicPr>
                   <pic:blipFill>
-                    <a:blip r:embed="rId16"/>
+                    <a:blip r:embed="rId17"/>
                     <a:stretch>
                       <a:fillRect/>
                     </a:stretch>
@@ -5656,7 +5723,15 @@
           <w:iCs/>
           <w:lang w:bidi="ar-SA"/>
         </w:rPr>
-        <w:t>Rys 2.1</w:t>
+        <w:t>R</w:t>
+      </w:r>
+      <w:r>
+        <w:rPr>
+          <w:rFonts w:ascii="Calibri" w:hAnsi="Calibri"/>
+          <w:iCs/>
+          <w:lang w:bidi="ar-SA"/>
+        </w:rPr>
+        <w:t>ys 2.2.</w:t>
       </w:r>
     </w:p>
     <w:p>
@@ -5673,7 +5748,13 @@
         <w:rPr>
           <w:rFonts w:ascii="Calibri" w:hAnsi="Calibri"/>
         </w:rPr>
-        <w:t>CH1 – sygnał z generatora, CH2 – napięcie na kolektorze tranzystora T1</w:t>
+        <w:t>CH1 – sygnał z generatora, CH2 – napię</w:t>
+      </w:r>
+      <w:r>
+        <w:rPr>
+          <w:rFonts w:ascii="Calibri" w:hAnsi="Calibri"/>
+        </w:rPr>
+        <w:t>cie na kolektorze tranzystora T3</w:t>
       </w:r>
     </w:p>
     <w:p>
@@ -5681,15 +5762,180 @@
         <w:tabs>
           <w:tab w:val="left" w:pos="288"/>
         </w:tabs>
-        <w:jc w:val="center"/>
         <w:rPr>
           <w:rFonts w:ascii="Calibri" w:hAnsi="Calibri"/>
           <w:iCs/>
           <w:lang w:bidi="ar-SA"/>
         </w:rPr>
       </w:pPr>
-      <w:bookmarkStart w:id="0" w:name="_GoBack"/>
-      <w:bookmarkEnd w:id="0"/>
+    </w:p>
+    <w:p>
+      <w:pPr>
+        <w:tabs>
+          <w:tab w:val="left" w:pos="288"/>
+        </w:tabs>
+        <w:rPr>
+          <w:rFonts w:ascii="Calibri" w:hAnsi="Calibri" w:cs="Calibri"/>
+        </w:rPr>
+      </w:pPr>
+      <w:r>
+        <w:rPr>
+          <w:rFonts w:ascii="Calibri" w:hAnsi="Calibri" w:cs="Calibri"/>
+        </w:rPr>
+        <w:t>Z obserwowanych przebiegów wynika, że układ działa poprawnie. Dla stanu wysokiego sygnału sterującego tranzystor T3 włącza się i napięcie na drenie spada do małej wartości, natomiast dla stanu niskiego tranzystor jest wyłączony i napięcie na drenie rośnie do wartości bliskiej napięciu zasilania. Oznacza to poprawną pracę klucza.</w:t>
+      </w:r>
+    </w:p>
+    <w:p>
+      <w:pPr>
+        <w:tabs>
+          <w:tab w:val="left" w:pos="288"/>
+        </w:tabs>
+        <w:rPr>
+          <w:rFonts w:ascii="Calibri" w:hAnsi="Calibri" w:cs="Calibri"/>
+          <w:color w:val="000000"/>
+          <w:lang w:bidi="ar-SA"/>
+        </w:rPr>
+      </w:pPr>
+    </w:p>
+    <w:p>
+      <w:pPr>
+        <w:tabs>
+          <w:tab w:val="left" w:pos="288"/>
+        </w:tabs>
+        <w:rPr>
+          <w:rFonts w:ascii="Calibri" w:hAnsi="Calibri"/>
+          <w:color w:val="000000"/>
+          <w:lang w:bidi="ar-SA"/>
+        </w:rPr>
+      </w:pPr>
+      <w:r>
+        <w:rPr>
+          <w:rFonts w:ascii="Calibri" w:hAnsi="Calibri"/>
+          <w:color w:val="000000"/>
+          <w:lang w:bidi="ar-SA"/>
+        </w:rPr>
+        <w:t>Wyniki uzyskane w przypadku użycia danego tranzystora unipolarnego są prawie identyczne z wynikami, uzyskanymi dla tranzystora bipolarnego</w:t>
+      </w:r>
+      <w:r>
+        <w:rPr>
+          <w:rFonts w:ascii="Calibri" w:hAnsi="Calibri"/>
+          <w:color w:val="000000"/>
+          <w:lang w:bidi="ar-SA"/>
+        </w:rPr>
+        <w:t xml:space="preserve">. </w:t>
+      </w:r>
+      <w:r>
+        <w:rPr>
+          <w:rFonts w:ascii="Calibri" w:hAnsi="Calibri"/>
+          <w:color w:val="000000"/>
+          <w:lang w:bidi="ar-SA"/>
+        </w:rPr>
+        <w:t>To nas nie zaskoczyło</w:t>
+      </w:r>
+      <w:r>
+        <w:rPr>
+          <w:rFonts w:ascii="Calibri" w:hAnsi="Calibri"/>
+          <w:color w:val="000000"/>
+          <w:lang w:bidi="ar-SA"/>
+        </w:rPr>
+        <w:t>,</w:t>
+      </w:r>
+      <w:r>
+        <w:rPr>
+          <w:rFonts w:ascii="Calibri" w:hAnsi="Calibri"/>
+          <w:color w:val="000000"/>
+          <w:lang w:bidi="ar-SA"/>
+        </w:rPr>
+        <w:t xml:space="preserve"> </w:t>
+      </w:r>
+      <w:r>
+        <w:rPr>
+          <w:rFonts w:ascii="Calibri" w:hAnsi="Calibri"/>
+          <w:color w:val="000000"/>
+          <w:lang w:bidi="ar-SA"/>
+        </w:rPr>
+        <w:t xml:space="preserve">ponieważ </w:t>
+      </w:r>
+      <w:r>
+        <w:rPr>
+          <w:rFonts w:ascii="Calibri" w:hAnsi="Calibri"/>
+          <w:color w:val="000000"/>
+          <w:lang w:bidi="ar-SA"/>
+        </w:rPr>
+        <w:t xml:space="preserve">znamy, że dobrze zaprojektowany i </w:t>
+      </w:r>
+      <w:r>
+        <w:rPr>
+          <w:rFonts w:ascii="Calibri" w:hAnsi="Calibri"/>
+          <w:color w:val="000000"/>
+          <w:lang w:bidi="ar-SA"/>
+        </w:rPr>
+        <w:t xml:space="preserve">poprawnie działający klucz na tranzystorze MOS pracuje </w:t>
+      </w:r>
+      <w:r>
+        <w:rPr>
+          <w:rFonts w:ascii="Calibri" w:hAnsi="Calibri"/>
+          <w:color w:val="000000"/>
+          <w:lang w:bidi="ar-SA"/>
+        </w:rPr>
+        <w:t>identycznie</w:t>
+      </w:r>
+      <w:r>
+        <w:rPr>
+          <w:rFonts w:ascii="Calibri" w:hAnsi="Calibri"/>
+          <w:color w:val="000000"/>
+          <w:lang w:bidi="ar-SA"/>
+        </w:rPr>
+        <w:t xml:space="preserve"> klucz</w:t>
+      </w:r>
+      <w:r>
+        <w:rPr>
+          <w:rFonts w:ascii="Calibri" w:hAnsi="Calibri"/>
+          <w:color w:val="000000"/>
+          <w:lang w:bidi="ar-SA"/>
+        </w:rPr>
+        <w:t>owi</w:t>
+      </w:r>
+      <w:r>
+        <w:rPr>
+          <w:rFonts w:ascii="Calibri" w:hAnsi="Calibri"/>
+          <w:color w:val="000000"/>
+          <w:lang w:bidi="ar-SA"/>
+        </w:rPr>
+        <w:t xml:space="preserve"> opart</w:t>
+      </w:r>
+      <w:r>
+        <w:rPr>
+          <w:rFonts w:ascii="Calibri" w:hAnsi="Calibri"/>
+          <w:color w:val="000000"/>
+          <w:lang w:bidi="ar-SA"/>
+        </w:rPr>
+        <w:t>emu</w:t>
+      </w:r>
+      <w:r>
+        <w:rPr>
+          <w:rFonts w:ascii="Calibri" w:hAnsi="Calibri"/>
+          <w:color w:val="000000"/>
+          <w:lang w:bidi="ar-SA"/>
+        </w:rPr>
+        <w:t xml:space="preserve"> na</w:t>
+      </w:r>
+      <w:r>
+        <w:rPr>
+          <w:rFonts w:ascii="Calibri" w:hAnsi="Calibri"/>
+          <w:color w:val="000000"/>
+          <w:lang w:bidi="ar-SA"/>
+        </w:rPr>
+        <w:t xml:space="preserve"> </w:t>
+      </w:r>
+      <w:r>
+        <w:rPr>
+          <w:rFonts w:ascii="Calibri" w:hAnsi="Calibri"/>
+          <w:color w:val="000000"/>
+          <w:lang w:bidi="ar-SA"/>
+        </w:rPr>
+        <w:t>tranzystorze BJT.</w:t>
+      </w:r>
     </w:p>
     <w:p>
       <w:pPr>
@@ -5698,15 +5944,13 @@
         </w:tabs>
         <w:jc w:val="both"/>
         <w:rPr>
-          <w:rFonts w:ascii="Calibri" w:hAnsi="Calibri" w:cs="Calibri"/>
-        </w:rPr>
-      </w:pPr>
-      <w:r>
-        <w:rPr>
-          <w:rFonts w:ascii="Calibri" w:hAnsi="Calibri" w:cs="Calibri"/>
-        </w:rPr>
-        <w:t>Z obserwowanych przebiegów wynika, że układ działa poprawnie. Dla stanu wysokiego sygnału sterującego tranzystor T3 włącza się i napięcie na drenie spada do małej wartości, natomiast dla stanu niskiego tranzystor jest wyłączony i napięcie na drenie rośnie do wartości bliskiej napięciu zasilania. Oznacza to poprawną pracę klucza.</w:t>
-      </w:r>
+          <w:rFonts w:ascii="Calibri" w:hAnsi="Calibri"/>
+          <w:b/>
+          <w:bCs/>
+          <w:color w:val="000000"/>
+          <w:lang w:bidi="ar-SA"/>
+        </w:rPr>
+      </w:pPr>
     </w:p>
     <w:p>
       <w:pPr>
@@ -5715,7 +5959,9 @@
         </w:tabs>
         <w:jc w:val="both"/>
         <w:rPr>
-          <w:rFonts w:ascii="Calibri" w:hAnsi="Calibri" w:cs="Calibri"/>
+          <w:rFonts w:ascii="Calibri" w:hAnsi="Calibri"/>
+          <w:b/>
+          <w:bCs/>
           <w:color w:val="000000"/>
           <w:lang w:bidi="ar-SA"/>
         </w:rPr>
@@ -5729,138 +5975,12 @@
         <w:jc w:val="both"/>
         <w:rPr>
           <w:rFonts w:ascii="Calibri" w:hAnsi="Calibri"/>
+          <w:b/>
+          <w:bCs/>
           <w:color w:val="000000"/>
           <w:lang w:bidi="ar-SA"/>
         </w:rPr>
       </w:pPr>
-      <w:r>
-        <w:rPr>
-          <w:rFonts w:ascii="Calibri" w:hAnsi="Calibri"/>
-          <w:color w:val="000000"/>
-          <w:lang w:bidi="ar-SA"/>
-        </w:rPr>
-        <w:t>Wyniki uzyskane w przypadku użycia danego tranzystora unipolarnego są prawie identyczne z wynikami, uzyskanymi dla tranzystora bipolarnego</w:t>
-      </w:r>
-      <w:r>
-        <w:rPr>
-          <w:rFonts w:ascii="Calibri" w:hAnsi="Calibri"/>
-          <w:color w:val="000000"/>
-          <w:lang w:bidi="ar-SA"/>
-        </w:rPr>
-        <w:t xml:space="preserve">. </w:t>
-      </w:r>
-      <w:r>
-        <w:rPr>
-          <w:rFonts w:ascii="Calibri" w:hAnsi="Calibri"/>
-          <w:color w:val="000000"/>
-          <w:lang w:bidi="ar-SA"/>
-        </w:rPr>
-        <w:t>To nas nie zaskoczyło</w:t>
-      </w:r>
-      <w:r>
-        <w:rPr>
-          <w:rFonts w:ascii="Calibri" w:hAnsi="Calibri"/>
-          <w:color w:val="000000"/>
-          <w:lang w:bidi="ar-SA"/>
-        </w:rPr>
-        <w:t>,</w:t>
-      </w:r>
-      <w:r>
-        <w:rPr>
-          <w:rFonts w:ascii="Calibri" w:hAnsi="Calibri"/>
-          <w:color w:val="000000"/>
-          <w:lang w:bidi="ar-SA"/>
-        </w:rPr>
-        <w:t xml:space="preserve"> </w:t>
-      </w:r>
-      <w:r>
-        <w:rPr>
-          <w:rFonts w:ascii="Calibri" w:hAnsi="Calibri"/>
-          <w:color w:val="000000"/>
-          <w:lang w:bidi="ar-SA"/>
-        </w:rPr>
-        <w:t xml:space="preserve">ponieważ </w:t>
-      </w:r>
-      <w:r>
-        <w:rPr>
-          <w:rFonts w:ascii="Calibri" w:hAnsi="Calibri"/>
-          <w:color w:val="000000"/>
-          <w:lang w:bidi="ar-SA"/>
-        </w:rPr>
-        <w:t xml:space="preserve">znamy, że dobrze zaprojektowany i </w:t>
-      </w:r>
-      <w:r>
-        <w:rPr>
-          <w:rFonts w:ascii="Calibri" w:hAnsi="Calibri"/>
-          <w:color w:val="000000"/>
-          <w:lang w:bidi="ar-SA"/>
-        </w:rPr>
-        <w:t xml:space="preserve">poprawnie działający klucz na tranzystorze MOS pracuje </w:t>
-      </w:r>
-      <w:r>
-        <w:rPr>
-          <w:rFonts w:ascii="Calibri" w:hAnsi="Calibri"/>
-          <w:color w:val="000000"/>
-          <w:lang w:bidi="ar-SA"/>
-        </w:rPr>
-        <w:t>identycznie</w:t>
-      </w:r>
-      <w:r>
-        <w:rPr>
-          <w:rFonts w:ascii="Calibri" w:hAnsi="Calibri"/>
-          <w:color w:val="000000"/>
-          <w:lang w:bidi="ar-SA"/>
-        </w:rPr>
-        <w:t xml:space="preserve"> klucz</w:t>
-      </w:r>
-      <w:r>
-        <w:rPr>
-          <w:rFonts w:ascii="Calibri" w:hAnsi="Calibri"/>
-          <w:color w:val="000000"/>
-          <w:lang w:bidi="ar-SA"/>
-        </w:rPr>
-        <w:t>owi</w:t>
-      </w:r>
-      <w:r>
-        <w:rPr>
-          <w:rFonts w:ascii="Calibri" w:hAnsi="Calibri"/>
-          <w:color w:val="000000"/>
-          <w:lang w:bidi="ar-SA"/>
-        </w:rPr>
-        <w:t xml:space="preserve"> opart</w:t>
-      </w:r>
-      <w:r>
-        <w:rPr>
-          <w:rFonts w:ascii="Calibri" w:hAnsi="Calibri"/>
-          <w:color w:val="000000"/>
-          <w:lang w:bidi="ar-SA"/>
-        </w:rPr>
-        <w:t>emu</w:t>
-      </w:r>
-      <w:r>
-        <w:rPr>
-          <w:rFonts w:ascii="Calibri" w:hAnsi="Calibri"/>
-          <w:color w:val="000000"/>
-          <w:lang w:bidi="ar-SA"/>
-        </w:rPr>
-        <w:t xml:space="preserve"> na</w:t>
-      </w:r>
-      <w:r>
-        <w:rPr>
-          <w:rFonts w:ascii="Calibri" w:hAnsi="Calibri"/>
-          <w:color w:val="000000"/>
-          <w:lang w:bidi="ar-SA"/>
-        </w:rPr>
-        <w:t xml:space="preserve"> </w:t>
-      </w:r>
-      <w:r>
-        <w:rPr>
-          <w:rFonts w:ascii="Calibri" w:hAnsi="Calibri"/>
-          <w:color w:val="000000"/>
-          <w:lang w:bidi="ar-SA"/>
-        </w:rPr>
-        <w:t>tranzystorze BJT.</w:t>
-      </w:r>
     </w:p>
     <w:p>
       <w:pPr>
@@ -5885,49 +6005,61 @@
         <w:jc w:val="both"/>
         <w:rPr>
           <w:rFonts w:ascii="Calibri" w:hAnsi="Calibri"/>
-          <w:color w:val="000000"/>
-          <w:lang w:bidi="ar-SA"/>
-        </w:rPr>
-      </w:pPr>
-      <w:r>
-        <w:rPr>
-          <w:rFonts w:ascii="Calibri" w:hAnsi="Calibri"/>
           <w:b/>
           <w:bCs/>
           <w:color w:val="000000"/>
           <w:lang w:bidi="ar-SA"/>
         </w:rPr>
-        <w:t>B.</w:t>
-      </w:r>
-      <w:r>
-        <w:rPr>
-          <w:rFonts w:ascii="Calibri" w:hAnsi="Calibri"/>
-          <w:color w:val="000000"/>
-          <w:lang w:bidi="ar-SA"/>
-        </w:rPr>
-        <w:t xml:space="preserve"> Zwiększenie częstotliwości pracy klucza z tranzystorem unipolarnym.</w:t>
-      </w:r>
-    </w:p>
-    <w:p>
-      <w:pPr>
+      </w:pPr>
+    </w:p>
+    <w:p>
+      <w:pPr>
+        <w:pStyle w:val="aa"/>
+        <w:numPr>
+          <w:ilvl w:val="0"/>
+          <w:numId w:val="1"/>
+        </w:numPr>
         <w:tabs>
           <w:tab w:val="left" w:pos="288"/>
         </w:tabs>
-        <w:jc w:val="both"/>
-        <w:rPr>
-          <w:rFonts w:ascii="Calibri" w:hAnsi="Calibri"/>
-        </w:rPr>
-      </w:pPr>
-    </w:p>
-    <w:p>
-      <w:pPr>
+        <w:rPr>
+          <w:rFonts w:ascii="Calibri" w:hAnsi="Calibri"/>
+          <w:color w:val="000000"/>
+          <w:lang w:bidi="ar-SA"/>
+        </w:rPr>
+      </w:pPr>
+      <w:r>
+        <w:rPr>
+          <w:rFonts w:ascii="Calibri" w:hAnsi="Calibri"/>
+          <w:color w:val="000000"/>
+          <w:lang w:bidi="ar-SA"/>
+        </w:rPr>
+        <w:lastRenderedPageBreak/>
+        <w:t>Zwiększenie częstotliwości pracy klucza z tranzystorem unipolarnym</w:t>
+      </w:r>
+    </w:p>
+    <w:p>
+      <w:pPr>
+        <w:pStyle w:val="aa"/>
         <w:tabs>
           <w:tab w:val="left" w:pos="288"/>
         </w:tabs>
-        <w:jc w:val="center"/>
-        <w:rPr>
-          <w:rFonts w:ascii="Calibri" w:hAnsi="Calibri"/>
-          <w:color w:val="000000"/>
+        <w:ind w:left="450"/>
+        <w:rPr>
+          <w:rFonts w:ascii="Calibri" w:hAnsi="Calibri"/>
+          <w:color w:val="000000"/>
+          <w:lang w:bidi="ar-SA"/>
+        </w:rPr>
+      </w:pPr>
+    </w:p>
+    <w:p>
+      <w:pPr>
+        <w:pStyle w:val="aa"/>
+        <w:tabs>
+          <w:tab w:val="left" w:pos="288"/>
+        </w:tabs>
+        <w:ind w:left="450"/>
+        <w:rPr>
           <w:lang w:bidi="ar-SA"/>
         </w:rPr>
       </w:pPr>
@@ -5937,17 +6069,59 @@
           <w:lang w:val="ru-RU" w:eastAsia="ru-RU" w:bidi="ar-SA"/>
         </w:rPr>
         <w:drawing>
-          <wp:anchor distT="0" distB="0" distL="0" distR="0" simplePos="0" relativeHeight="251665408" behindDoc="0" locked="0" layoutInCell="0" allowOverlap="1" wp14:anchorId="764445FC" wp14:editId="343DBC19">
-            <wp:simplePos x="0" y="0"/>
-            <wp:positionH relativeFrom="margin">
-              <wp:posOffset>3093085</wp:posOffset>
-            </wp:positionH>
-            <wp:positionV relativeFrom="paragraph">
-              <wp:posOffset>3810</wp:posOffset>
-            </wp:positionV>
-            <wp:extent cx="3032125" cy="1776730"/>
-            <wp:effectExtent l="0" t="0" r="0" b="0"/>
-            <wp:wrapSquare wrapText="largest"/>
+          <wp:inline distT="0" distB="0" distL="0" distR="0">
+            <wp:extent cx="2757170" cy="1615440"/>
+            <wp:effectExtent l="0" t="0" r="5080" b="3810"/>
+            <wp:docPr id="12" name="Obraz12"/>
+            <wp:cNvGraphicFramePr>
+              <a:graphicFrameLocks xmlns:a="http://schemas.openxmlformats.org/drawingml/2006/main" noChangeAspect="1"/>
+            </wp:cNvGraphicFramePr>
+            <a:graphic xmlns:a="http://schemas.openxmlformats.org/drawingml/2006/main">
+              <a:graphicData uri="http://schemas.openxmlformats.org/drawingml/2006/picture">
+                <pic:pic xmlns:pic="http://schemas.openxmlformats.org/drawingml/2006/picture">
+                  <pic:nvPicPr>
+                    <pic:cNvPr id="12" name="Obraz12"/>
+                    <pic:cNvPicPr>
+                      <a:picLocks noChangeAspect="1" noChangeArrowheads="1"/>
+                    </pic:cNvPicPr>
+                  </pic:nvPicPr>
+                  <pic:blipFill>
+                    <a:blip r:embed="rId18" cstate="print">
+                      <a:extLst>
+                        <a:ext uri="{28A0092B-C50C-407E-A947-70E740481C1C}">
+                          <a14:useLocalDpi xmlns:a14="http://schemas.microsoft.com/office/drawing/2010/main" val="0"/>
+                        </a:ext>
+                      </a:extLst>
+                    </a:blip>
+                    <a:stretch>
+                      <a:fillRect/>
+                    </a:stretch>
+                  </pic:blipFill>
+                  <pic:spPr bwMode="auto">
+                    <a:xfrm>
+                      <a:off x="0" y="0"/>
+                      <a:ext cx="2757170" cy="1615440"/>
+                    </a:xfrm>
+                    <a:prstGeom prst="rect">
+                      <a:avLst/>
+                    </a:prstGeom>
+                    <a:noFill/>
+                  </pic:spPr>
+                </pic:pic>
+              </a:graphicData>
+            </a:graphic>
+          </wp:inline>
+        </w:drawing>
+      </w:r>
+      <w:r>
+        <w:rPr>
+          <w:noProof/>
+          <w:lang w:val="ru-RU" w:eastAsia="ru-RU" w:bidi="ar-SA"/>
+        </w:rPr>
+        <w:drawing>
+          <wp:inline distT="0" distB="0" distL="0" distR="0" wp14:anchorId="2D5B91BC" wp14:editId="2CF2A9C5">
+            <wp:extent cx="2750820" cy="1612432"/>
+            <wp:effectExtent l="0" t="0" r="0" b="6985"/>
             <wp:docPr id="13" name="Obraz13"/>
             <wp:cNvGraphicFramePr>
               <a:graphicFrameLocks xmlns:a="http://schemas.openxmlformats.org/drawingml/2006/main" noChangeAspect="1"/>
@@ -5962,7 +6136,13 @@
                     </pic:cNvPicPr>
                   </pic:nvPicPr>
                   <pic:blipFill>
-                    <a:blip r:embed="rId17"/>
+                    <a:blip r:embed="rId19" cstate="print">
+                      <a:extLst>
+                        <a:ext uri="{28A0092B-C50C-407E-A947-70E740481C1C}">
+                          <a14:useLocalDpi xmlns:a14="http://schemas.microsoft.com/office/drawing/2010/main" val="0"/>
+                        </a:ext>
+                      </a:extLst>
+                    </a:blip>
                     <a:stretch>
                       <a:fillRect/>
                     </a:stretch>
@@ -5970,7 +6150,7 @@
                   <pic:spPr bwMode="auto">
                     <a:xfrm>
                       <a:off x="0" y="0"/>
-                      <a:ext cx="3032125" cy="1776730"/>
+                      <a:ext cx="2755103" cy="1614942"/>
                     </a:xfrm>
                     <a:prstGeom prst="rect">
                       <a:avLst/>
@@ -5980,106 +6160,43 @@
                 </pic:pic>
               </a:graphicData>
             </a:graphic>
-            <wp14:sizeRelH relativeFrom="margin">
-              <wp14:pctWidth>0</wp14:pctWidth>
-            </wp14:sizeRelH>
-            <wp14:sizeRelV relativeFrom="margin">
-              <wp14:pctHeight>0</wp14:pctHeight>
-            </wp14:sizeRelV>
-          </wp:anchor>
+          </wp:inline>
         </w:drawing>
       </w:r>
-      <w:r>
-        <w:rPr>
-          <w:rFonts w:ascii="Calibri" w:hAnsi="Calibri"/>
-          <w:noProof/>
-          <w:lang w:val="ru-RU" w:eastAsia="ru-RU" w:bidi="ar-SA"/>
-        </w:rPr>
-        <w:drawing>
-          <wp:anchor distT="0" distB="0" distL="0" distR="0" simplePos="0" relativeHeight="251664384" behindDoc="0" locked="0" layoutInCell="0" allowOverlap="1" wp14:anchorId="3F65E61F" wp14:editId="433A0156">
-            <wp:simplePos x="0" y="0"/>
-            <wp:positionH relativeFrom="margin">
-              <wp:align>left</wp:align>
-            </wp:positionH>
-            <wp:positionV relativeFrom="paragraph">
-              <wp:posOffset>3810</wp:posOffset>
-            </wp:positionV>
-            <wp:extent cx="3032760" cy="1776730"/>
-            <wp:effectExtent l="0" t="0" r="0" b="0"/>
-            <wp:wrapSquare wrapText="largest"/>
-            <wp:docPr id="12" name="Obraz12"/>
-            <wp:cNvGraphicFramePr>
-              <a:graphicFrameLocks xmlns:a="http://schemas.openxmlformats.org/drawingml/2006/main" noChangeAspect="1"/>
-            </wp:cNvGraphicFramePr>
-            <a:graphic xmlns:a="http://schemas.openxmlformats.org/drawingml/2006/main">
-              <a:graphicData uri="http://schemas.openxmlformats.org/drawingml/2006/picture">
-                <pic:pic xmlns:pic="http://schemas.openxmlformats.org/drawingml/2006/picture">
-                  <pic:nvPicPr>
-                    <pic:cNvPr id="12" name="Obraz12"/>
-                    <pic:cNvPicPr>
-                      <a:picLocks noChangeAspect="1" noChangeArrowheads="1"/>
-                    </pic:cNvPicPr>
-                  </pic:nvPicPr>
-                  <pic:blipFill>
-                    <a:blip r:embed="rId18"/>
-                    <a:stretch>
-                      <a:fillRect/>
-                    </a:stretch>
-                  </pic:blipFill>
-                  <pic:spPr bwMode="auto">
-                    <a:xfrm>
-                      <a:off x="0" y="0"/>
-                      <a:ext cx="3063377" cy="1794734"/>
-                    </a:xfrm>
-                    <a:prstGeom prst="rect">
-                      <a:avLst/>
-                    </a:prstGeom>
-                    <a:noFill/>
-                  </pic:spPr>
-                </pic:pic>
-              </a:graphicData>
-            </a:graphic>
-            <wp14:sizeRelH relativeFrom="margin">
-              <wp14:pctWidth>0</wp14:pctWidth>
-            </wp14:sizeRelH>
-            <wp14:sizeRelV relativeFrom="margin">
-              <wp14:pctHeight>0</wp14:pctHeight>
-            </wp14:sizeRelV>
-          </wp:anchor>
-        </w:drawing>
-      </w:r>
-      <w:r>
+    </w:p>
+    <w:p>
+      <w:pPr>
+        <w:ind w:left="1418"/>
         <w:rPr>
           <w:rFonts w:ascii="Calibri" w:hAnsi="Calibri"/>
           <w:color w:val="000000"/>
           <w:lang w:bidi="ar-SA"/>
         </w:rPr>
-        <w:t>Po</w:t>
-      </w:r>
-      <w:r>
-        <w:rPr>
-          <w:rFonts w:ascii="Calibri" w:hAnsi="Calibri"/>
-          <w:color w:val="000000"/>
+      </w:pPr>
+      <w:r>
+        <w:rPr>
           <w:lang w:bidi="ar-SA"/>
         </w:rPr>
+        <w:t>Rys.</w:t>
+      </w:r>
+      <w:r>
+        <w:rPr>
+          <w:lang w:bidi="ar-SA"/>
+        </w:rPr>
+        <w:t xml:space="preserve"> 2.3.</w:t>
+      </w:r>
+      <w:r>
+        <w:rPr>
+          <w:lang w:bidi="ar-SA"/>
+        </w:rPr>
         <w:t xml:space="preserve"> </w:t>
-      </w:r>
-      <w:r>
-        <w:rPr>
-          <w:rFonts w:ascii="Calibri" w:hAnsi="Calibri"/>
-          <w:color w:val="000000"/>
-          <w:lang w:bidi="ar-SA"/>
-        </w:rPr>
-        <w:t xml:space="preserve">lewej stronie </w:t>
       </w:r>
       <m:oMath>
         <m:r>
           <w:rPr>
             <w:rFonts w:ascii="Cambria Math" w:hAnsi="Cambria Math"/>
-            <w:color w:val="000000"/>
-            <w:lang w:val="ru-RU" w:bidi="ar-SA"/>
           </w:rPr>
-          <m:t>φ</m:t>
+          <m:t>f</m:t>
         </m:r>
         <m:r>
           <w:rPr>
@@ -6089,162 +6206,316 @@
           </w:rPr>
           <m:t xml:space="preserve"> </m:t>
         </m:r>
+        <m:r>
+          <m:rPr>
+            <m:sty m:val="p"/>
+          </m:rPr>
+          <w:rPr>
+            <w:rFonts w:ascii="Cambria Math" w:hAnsi="Cambria Math"/>
+            <w:color w:val="000000"/>
+            <w:lang w:bidi="ar-SA"/>
+          </w:rPr>
+          <m:t>=</m:t>
+        </m:r>
+        <m:r>
+          <m:rPr>
+            <m:sty m:val="p"/>
+          </m:rPr>
+          <w:rPr>
+            <w:rFonts w:ascii="Cambria Math" w:hAnsi="Calibri"/>
+            <w:color w:val="000000"/>
+            <w:lang w:bidi="ar-SA"/>
+          </w:rPr>
+          <m:t>26</m:t>
+        </m:r>
+        <m:r>
+          <m:rPr>
+            <m:sty m:val="p"/>
+          </m:rPr>
+          <w:rPr>
+            <w:rFonts w:ascii="Cambria Math" w:hAnsi="Calibri"/>
+            <w:color w:val="000000"/>
+            <w:lang w:bidi="ar-SA"/>
+          </w:rPr>
+          <m:t> </m:t>
+        </m:r>
+        <m:r>
+          <m:rPr>
+            <m:sty m:val="p"/>
+          </m:rPr>
+          <w:rPr>
+            <w:rFonts w:ascii="Cambria Math" w:hAnsi="Calibri"/>
+            <w:color w:val="000000"/>
+            <w:lang w:bidi="ar-SA"/>
+          </w:rPr>
+          <m:t>kHz</m:t>
+        </m:r>
       </m:oMath>
       <w:r>
         <w:rPr>
-          <w:rFonts w:ascii="Calibri" w:hAnsi="Calibri"/>
-          <w:color w:val="000000"/>
           <w:lang w:bidi="ar-SA"/>
         </w:rPr>
-        <w:t xml:space="preserve">= 26Khz, po prawej dodajemy rezystor 100 </w:t>
+        <w:tab/>
+      </w:r>
+      <w:r>
+        <w:rPr>
+          <w:lang w:bidi="ar-SA"/>
+        </w:rPr>
+        <w:tab/>
+        <w:t xml:space="preserve">   </w:t>
+      </w:r>
+      <w:r>
+        <w:rPr>
+          <w:lang w:bidi="ar-SA"/>
+        </w:rPr>
+        <w:t xml:space="preserve">  </w:t>
+      </w:r>
+      <w:r>
+        <w:rPr>
+          <w:lang w:bidi="ar-SA"/>
+        </w:rPr>
+        <w:t>Rys. 2.4.</w:t>
       </w:r>
       <m:oMath>
+        <m:r>
+          <w:rPr>
+            <w:rFonts w:ascii="Cambria Math" w:hAnsi="Cambria Math"/>
+            <w:lang w:bidi="ar-SA"/>
+          </w:rPr>
+          <m:t xml:space="preserve">  R=100 Ω</m:t>
+        </m:r>
+      </m:oMath>
+      <w:r>
+        <w:rPr>
+          <w:lang w:bidi="ar-SA"/>
+        </w:rPr>
+        <w:t> </w:t>
+      </w:r>
+      <m:oMath>
+        <m:r>
+          <w:rPr>
+            <w:rFonts w:ascii="Cambria Math" w:hAnsi="Cambria Math"/>
+          </w:rPr>
+          <m:t>f</m:t>
+        </m:r>
         <m:r>
           <w:rPr>
             <w:rFonts w:ascii="Cambria Math" w:hAnsi="Cambria Math"/>
             <w:color w:val="000000"/>
             <w:lang w:bidi="ar-SA"/>
           </w:rPr>
-          <m:t>Ω</m:t>
+          <m:t xml:space="preserve"> </m:t>
         </m:r>
-      </m:oMath>
-      <w:r>
-        <w:rPr>
-          <w:rFonts w:ascii="Calibri" w:hAnsi="Calibri"/>
-          <w:color w:val="000000"/>
-          <w:lang w:bidi="ar-SA"/>
-        </w:rPr>
-        <w:t xml:space="preserve"> i zwiększamy </w:t>
-      </w:r>
-      <m:oMath>
         <m:r>
+          <m:rPr>
+            <m:sty m:val="p"/>
+          </m:rPr>
           <w:rPr>
             <w:rFonts w:ascii="Cambria Math" w:hAnsi="Cambria Math"/>
             <w:color w:val="000000"/>
-            <w:lang w:val="ru-RU" w:bidi="ar-SA"/>
+            <w:lang w:bidi="ar-SA"/>
           </w:rPr>
-          <m:t>φ</m:t>
+          <m:t>=</m:t>
+        </m:r>
+        <m:r>
+          <m:rPr>
+            <m:sty m:val="p"/>
+          </m:rPr>
+          <w:rPr>
+            <w:rFonts w:ascii="Cambria Math" w:hAnsi="Calibri"/>
+            <w:color w:val="000000"/>
+            <w:lang w:bidi="ar-SA"/>
+          </w:rPr>
+          <m:t>400</m:t>
+        </m:r>
+        <m:r>
+          <m:rPr>
+            <m:sty m:val="p"/>
+          </m:rPr>
+          <w:rPr>
+            <w:rFonts w:ascii="Cambria Math" w:hAnsi="Calibri"/>
+            <w:color w:val="000000"/>
+            <w:lang w:bidi="ar-SA"/>
+          </w:rPr>
+          <m:t> </m:t>
+        </m:r>
+        <m:r>
+          <m:rPr>
+            <m:sty m:val="p"/>
+          </m:rPr>
+          <w:rPr>
+            <w:rFonts w:ascii="Cambria Math" w:hAnsi="Calibri"/>
+            <w:color w:val="000000"/>
+            <w:lang w:bidi="ar-SA"/>
+          </w:rPr>
+          <m:t>kHz</m:t>
         </m:r>
       </m:oMath>
-      <w:r>
-        <w:rPr>
-          <w:rFonts w:ascii="Calibri" w:hAnsi="Calibri"/>
-          <w:color w:val="000000"/>
-          <w:lang w:bidi="ar-SA"/>
-        </w:rPr>
-        <w:t xml:space="preserve"> = 400Khz</w:t>
-      </w:r>
     </w:p>
     <w:p>
       <w:pPr>
         <w:tabs>
           <w:tab w:val="left" w:pos="288"/>
         </w:tabs>
-        <w:jc w:val="both"/>
-        <w:rPr>
-          <w:rFonts w:ascii="Calibri" w:hAnsi="Calibri"/>
-          <w:color w:val="000000"/>
-          <w:lang w:bidi="ar-SA"/>
-        </w:rPr>
-      </w:pPr>
+        <w:jc w:val="center"/>
+        <w:rPr>
+          <w:rFonts w:ascii="Calibri" w:hAnsi="Calibri"/>
+        </w:rPr>
+      </w:pPr>
+      <w:r>
+        <w:rPr>
+          <w:rFonts w:ascii="Calibri" w:hAnsi="Calibri"/>
+        </w:rPr>
+        <w:t>CH1 – sygnał z generatora, CH2 – napię</w:t>
+      </w:r>
+      <w:r>
+        <w:rPr>
+          <w:rFonts w:ascii="Calibri" w:hAnsi="Calibri"/>
+        </w:rPr>
+        <w:t>cie na kolektorze tranzystora T3</w:t>
+      </w:r>
     </w:p>
     <w:p>
       <w:pPr>
         <w:tabs>
           <w:tab w:val="left" w:pos="288"/>
         </w:tabs>
-        <w:jc w:val="both"/>
-        <w:rPr>
-          <w:rFonts w:ascii="Calibri" w:hAnsi="Calibri" w:cs="Calibri"/>
-        </w:rPr>
-      </w:pPr>
-      <w:r>
-        <w:rPr>
-          <w:rFonts w:ascii="Calibri" w:hAnsi="Calibri" w:cs="Calibri"/>
-        </w:rPr>
-        <w:t xml:space="preserve">Po zwiększeniu częstotliwości pracy klucza z tranzystorem </w:t>
-      </w:r>
-      <w:r>
-        <w:rPr>
-          <w:rStyle w:val="ac"/>
-          <w:rFonts w:ascii="Calibri" w:hAnsi="Calibri" w:cs="Calibri"/>
-        </w:rPr>
-        <w:t>T3</w:t>
-      </w:r>
-      <w:r>
-        <w:rPr>
-          <w:rFonts w:ascii="Calibri" w:hAnsi="Calibri" w:cs="Calibri"/>
-        </w:rPr>
-        <w:t xml:space="preserve"> przy pozostawieniu dotychczasowego rezystora </w:t>
-      </w:r>
-      <w:r>
-        <w:rPr>
-          <w:rStyle w:val="ac"/>
-          <w:rFonts w:ascii="Calibri" w:hAnsi="Calibri" w:cs="Calibri"/>
-        </w:rPr>
-        <w:t>RG</w:t>
-      </w:r>
-      <w:r>
-        <w:rPr>
-          <w:rFonts w:ascii="Calibri" w:hAnsi="Calibri" w:cs="Calibri"/>
-        </w:rPr>
-        <w:t xml:space="preserve"> pojawiło się pogorszenie przełączania. Około </w:t>
-      </w:r>
-      <w:r>
-        <w:rPr>
-          <w:rStyle w:val="ac"/>
-          <w:rFonts w:ascii="Calibri" w:hAnsi="Calibri" w:cs="Calibri"/>
-        </w:rPr>
-        <w:t>26 kHz</w:t>
-      </w:r>
-      <w:r>
-        <w:rPr>
-          <w:rFonts w:ascii="Calibri" w:hAnsi="Calibri" w:cs="Calibri"/>
-        </w:rPr>
-        <w:t xml:space="preserve"> przebieg napięcia na drenie przestał być idealnie prostokątny: zbocza stały się zaokrąglone, pojawiło się opóźnienie względem sygnału wejściowego, a tranzystor przez zauważalny czas pracował w stanie pośrednim zamiast szybk</w:t>
-      </w:r>
-      <w:r>
-        <w:rPr>
-          <w:rFonts w:ascii="Calibri" w:hAnsi="Calibri" w:cs="Calibri"/>
-        </w:rPr>
-        <w:t>iego</w:t>
-      </w:r>
-      <w:r>
-        <w:rPr>
-          <w:rFonts w:ascii="Calibri" w:hAnsi="Calibri" w:cs="Calibri"/>
-        </w:rPr>
-        <w:t xml:space="preserve"> przechodz</w:t>
-      </w:r>
-      <w:r>
-        <w:rPr>
-          <w:rFonts w:ascii="Calibri" w:hAnsi="Calibri" w:cs="Calibri"/>
-        </w:rPr>
-        <w:t>enia</w:t>
-      </w:r>
-      <w:r>
-        <w:rPr>
-          <w:rFonts w:ascii="Calibri" w:hAnsi="Calibri" w:cs="Calibri"/>
-        </w:rPr>
-        <w:t xml:space="preserve"> między pełnym włączeniem i wyłączeniem. Oznacza to wzrost czasu przełączania i pogorszenie jakości pracy klucza.</w:t>
-      </w:r>
+        <w:jc w:val="center"/>
+        <w:rPr>
+          <w:rFonts w:ascii="Calibri" w:hAnsi="Calibri"/>
+        </w:rPr>
+      </w:pPr>
     </w:p>
     <w:p>
       <w:pPr>
         <w:tabs>
           <w:tab w:val="left" w:pos="288"/>
         </w:tabs>
-        <w:jc w:val="both"/>
-        <w:rPr>
-          <w:rFonts w:ascii="Calibri" w:hAnsi="Calibri" w:cs="Calibri"/>
-        </w:rPr>
-      </w:pPr>
+        <w:rPr>
+          <w:rFonts w:ascii="Calibri" w:hAnsi="Calibri" w:cs="Calibri"/>
+        </w:rPr>
+      </w:pPr>
+      <w:r>
+        <w:rPr>
+          <w:rFonts w:ascii="Calibri" w:hAnsi="Calibri" w:cs="Calibri"/>
+        </w:rPr>
+        <w:t xml:space="preserve">Po zwiększeniu częstotliwości pracy klucza z tranzystorem </w:t>
+      </w:r>
+      <w:r>
+        <w:rPr>
+          <w:rStyle w:val="ac"/>
+          <w:rFonts w:ascii="Calibri" w:hAnsi="Calibri" w:cs="Calibri"/>
+        </w:rPr>
+        <w:t>T3</w:t>
+      </w:r>
+      <w:r>
+        <w:rPr>
+          <w:rFonts w:ascii="Calibri" w:hAnsi="Calibri" w:cs="Calibri"/>
+        </w:rPr>
+        <w:t xml:space="preserve"> przy pozostawieniu dotychczasowego rezystora </w:t>
+      </w:r>
+      <w:r>
+        <w:rPr>
+          <w:rStyle w:val="ac"/>
+          <w:rFonts w:ascii="Calibri" w:hAnsi="Calibri" w:cs="Calibri"/>
+        </w:rPr>
+        <w:t>RG</w:t>
+      </w:r>
+      <w:r>
+        <w:rPr>
+          <w:rFonts w:ascii="Calibri" w:hAnsi="Calibri" w:cs="Calibri"/>
+        </w:rPr>
+        <w:t xml:space="preserve"> pojawiło się pogorszenie przełączania</w:t>
+      </w:r>
+      <w:r>
+        <w:rPr>
+          <w:rFonts w:ascii="Calibri" w:hAnsi="Calibri" w:cs="Calibri"/>
+        </w:rPr>
+        <w:t>(Rys 2.3)</w:t>
+      </w:r>
+      <w:r>
+        <w:rPr>
+          <w:rFonts w:ascii="Calibri" w:hAnsi="Calibri" w:cs="Calibri"/>
+        </w:rPr>
+        <w:t xml:space="preserve">. </w:t>
+      </w:r>
+      <w:r>
+        <w:rPr>
+          <w:rFonts w:ascii="Calibri" w:hAnsi="Calibri" w:cs="Calibri"/>
+          <w:color w:val="FFC000"/>
+        </w:rPr>
+        <w:t>Około</w:t>
+      </w:r>
+      <w:r>
+        <w:rPr>
+          <w:rFonts w:ascii="Calibri" w:hAnsi="Calibri" w:cs="Calibri"/>
+          <w:color w:val="FFC000"/>
+        </w:rPr>
+        <w:t xml:space="preserve"> </w:t>
+      </w:r>
+      <m:oMath>
+        <m:r>
+          <m:rPr>
+            <m:sty m:val="bi"/>
+          </m:rPr>
+          <w:rPr>
+            <w:rFonts w:ascii="Cambria Math" w:hAnsi="Cambria Math"/>
+            <w:color w:val="FFC000"/>
+          </w:rPr>
+          <m:t>f=26 kHz</m:t>
+        </m:r>
+      </m:oMath>
+      <w:r>
+        <w:rPr>
+          <w:rFonts w:ascii="Calibri" w:hAnsi="Calibri" w:cs="Calibri"/>
+          <w:color w:val="FFC000"/>
+        </w:rPr>
+        <w:t xml:space="preserve"> przebieg napięcia na drenie przestał być idealnie prostokątny: zbocza stały się zaokrąglone, pojawiło się opóźnienie względem sygnału wejściowego, a tranzystor przez zauważalny </w:t>
+      </w:r>
+      <w:r>
+        <w:rPr>
+          <w:rFonts w:ascii="Calibri" w:hAnsi="Calibri" w:cs="Calibri"/>
+          <w:color w:val="FFC000"/>
+        </w:rPr>
+        <w:t>czas pracował w stanie przewodzenia</w:t>
+      </w:r>
+      <w:r>
+        <w:rPr>
+          <w:rFonts w:ascii="Calibri" w:hAnsi="Calibri" w:cs="Calibri"/>
+          <w:color w:val="FFC000"/>
+        </w:rPr>
+        <w:t xml:space="preserve"> zamiast szybkiego przechodzenia</w:t>
+      </w:r>
+      <w:r>
+        <w:rPr>
+          <w:rFonts w:ascii="Calibri" w:hAnsi="Calibri" w:cs="Calibri"/>
+          <w:color w:val="FFC000"/>
+        </w:rPr>
+        <w:t xml:space="preserve"> między stanem nasycenia i wyłączenia</w:t>
+      </w:r>
+      <w:r>
+        <w:rPr>
+          <w:rFonts w:ascii="Calibri" w:hAnsi="Calibri" w:cs="Calibri"/>
+          <w:color w:val="FFC000"/>
+        </w:rPr>
+        <w:t>. Oznacza to wzrost czasu przełączania i pogorszenie jakości pracy klucza.</w:t>
+      </w:r>
     </w:p>
     <w:p>
       <w:pPr>
         <w:tabs>
           <w:tab w:val="left" w:pos="288"/>
         </w:tabs>
-        <w:jc w:val="both"/>
+        <w:rPr>
+          <w:rFonts w:ascii="Calibri" w:hAnsi="Calibri" w:cs="Calibri"/>
+        </w:rPr>
+      </w:pPr>
+    </w:p>
+    <w:p>
+      <w:pPr>
+        <w:tabs>
+          <w:tab w:val="left" w:pos="288"/>
+        </w:tabs>
         <w:rPr>
           <w:rFonts w:ascii="Calibri" w:hAnsi="Calibri" w:cs="Calibri"/>
         </w:rPr>
@@ -6339,7 +6610,6 @@
         <w:tabs>
           <w:tab w:val="left" w:pos="288"/>
         </w:tabs>
-        <w:jc w:val="both"/>
         <w:rPr>
           <w:rFonts w:ascii="Calibri" w:hAnsi="Calibri" w:cs="Calibri"/>
         </w:rPr>
@@ -6350,16 +6620,33 @@
         <w:tabs>
           <w:tab w:val="left" w:pos="288"/>
         </w:tabs>
-        <w:jc w:val="both"/>
-        <w:rPr>
-          <w:rFonts w:ascii="Calibri" w:hAnsi="Calibri" w:cs="Calibri"/>
-        </w:rPr>
-      </w:pPr>
-      <w:r>
-        <w:rPr>
-          <w:rFonts w:ascii="Calibri" w:hAnsi="Calibri" w:cs="Calibri"/>
-        </w:rPr>
-        <w:t xml:space="preserve">W tym miejscu </w:t>
+        <w:rPr>
+          <w:rFonts w:ascii="Calibri" w:hAnsi="Calibri" w:cs="Calibri"/>
+        </w:rPr>
+      </w:pPr>
+      <w:r>
+        <w:rPr>
+          <w:rFonts w:ascii="Calibri" w:hAnsi="Calibri" w:cs="Calibri"/>
+        </w:rPr>
+        <w:t>W</w:t>
+      </w:r>
+      <w:r>
+        <w:rPr>
+          <w:rFonts w:ascii="Calibri" w:hAnsi="Calibri" w:cs="Calibri"/>
+        </w:rPr>
+        <w:t xml:space="preserve"> celu poprawienia pracy tego klucza </w:t>
+      </w:r>
+      <w:r>
+        <w:rPr>
+          <w:rFonts w:ascii="Calibri" w:hAnsi="Calibri" w:cs="Calibri"/>
+        </w:rPr>
+        <w:t>przy zwiększonej częstotliwości</w:t>
+      </w:r>
+      <w:r>
+        <w:rPr>
+          <w:rFonts w:ascii="Calibri" w:hAnsi="Calibri" w:cs="Calibri"/>
+        </w:rPr>
+        <w:t xml:space="preserve"> </w:t>
       </w:r>
       <w:r>
         <w:rPr>
@@ -6409,7 +6696,6 @@
         <w:tabs>
           <w:tab w:val="left" w:pos="288"/>
         </w:tabs>
-        <w:jc w:val="both"/>
         <w:rPr>
           <w:rFonts w:ascii="Calibri" w:hAnsi="Calibri" w:cs="Calibri"/>
         </w:rPr>
@@ -6420,7 +6706,6 @@
         <w:tabs>
           <w:tab w:val="left" w:pos="288"/>
         </w:tabs>
-        <w:jc w:val="both"/>
         <w:rPr>
           <w:rFonts w:ascii="Calibri" w:hAnsi="Calibri" w:cs="Calibri"/>
         </w:rPr>
@@ -6441,13 +6726,49 @@
         <w:rPr>
           <w:rFonts w:ascii="Calibri" w:hAnsi="Calibri" w:cs="Calibri"/>
         </w:rPr>
-        <w:t xml:space="preserve"> kHz.</w:t>
-      </w:r>
-      <w:r>
-        <w:rPr>
-          <w:rFonts w:ascii="Calibri" w:hAnsi="Calibri" w:cs="Calibri"/>
-        </w:rPr>
-        <w:t xml:space="preserve"> Pokazuje to, że klucz z MOSFET-em może pracować szybciej od klucza bipolarnego, ale tylko wtedy, gdy układ sterujący potrafi odpowiednio szybko przeładować pojemność bramki. Jednocześnie zbyt mały rezystor bramkowy nie jest rozwiązaniem idealnym, bo powoduje duże chwilowe prądy ładowania i rozładowywania bramki, może nadmiernie obciążyć źródło sterujące i prowadzić do skutków ubocznych.</w:t>
+        <w:t xml:space="preserve"> kHz</w:t>
+      </w:r>
+      <w:r>
+        <w:rPr>
+          <w:rFonts w:ascii="Calibri" w:hAnsi="Calibri" w:cs="Calibri"/>
+        </w:rPr>
+        <w:t>(Rys. 2.4)</w:t>
+      </w:r>
+      <w:r>
+        <w:rPr>
+          <w:rFonts w:ascii="Calibri" w:hAnsi="Calibri" w:cs="Calibri"/>
+        </w:rPr>
+        <w:t>.</w:t>
+      </w:r>
+      <w:r>
+        <w:rPr>
+          <w:rFonts w:ascii="Calibri" w:hAnsi="Calibri" w:cs="Calibri"/>
+        </w:rPr>
+        <w:t xml:space="preserve"> Pokazuje to,</w:t>
+      </w:r>
+      <w:r>
+        <w:rPr>
+          <w:rFonts w:ascii="Calibri" w:hAnsi="Calibri" w:cs="Calibri"/>
+        </w:rPr>
+        <w:t xml:space="preserve"> że klucz z MOSFET-em można zoptymalizować</w:t>
+      </w:r>
+      <w:r>
+        <w:rPr>
+          <w:rFonts w:ascii="Calibri" w:hAnsi="Calibri" w:cs="Calibri"/>
+        </w:rPr>
+        <w:t>, ale tylko wtedy, gdy układ sterujący potrafi odpowiednio szybko przeładować pojemność bramki. Jednocześnie zbyt mały rezystor bramkowy nie jest rozwiązaniem idealnym, bo powoduje duże chwilowe prądy ład</w:t>
+      </w:r>
+      <w:r>
+        <w:rPr>
+          <w:rFonts w:ascii="Calibri" w:hAnsi="Calibri" w:cs="Calibri"/>
+        </w:rPr>
+        <w:t xml:space="preserve">owania i rozładowywania bramki i </w:t>
+      </w:r>
+      <w:r>
+        <w:rPr>
+          <w:rFonts w:ascii="Calibri" w:hAnsi="Calibri" w:cs="Calibri"/>
+        </w:rPr>
+        <w:t>może nadmiernie obciążyć źródło sterujące i prowadzić do skutków ubocznych.</w:t>
       </w:r>
     </w:p>
     <w:p>
@@ -6455,7 +6776,6 @@
         <w:tabs>
           <w:tab w:val="left" w:pos="288"/>
         </w:tabs>
-        <w:jc w:val="both"/>
         <w:rPr>
           <w:rFonts w:ascii="Calibri" w:hAnsi="Calibri" w:cs="Calibri"/>
         </w:rPr>
@@ -6466,7 +6786,6 @@
         <w:tabs>
           <w:tab w:val="left" w:pos="288"/>
         </w:tabs>
-        <w:jc w:val="both"/>
         <w:rPr>
           <w:rFonts w:ascii="Calibri" w:hAnsi="Calibri" w:cs="Calibri"/>
           <w:b/>
@@ -6492,7 +6811,21 @@
           <w:rStyle w:val="ac"/>
           <w:rFonts w:ascii="Calibri" w:hAnsi="Calibri" w:cs="Calibri"/>
         </w:rPr>
-        <w:t>ograniczeniem szybkości klucza z tranzystorem T3 nie był brak „mocy” samego tranzystora, lecz zbyt wolne sterowanie pojemnością bramki</w:t>
+        <w:t xml:space="preserve">ograniczeniem szybkości klucza z tranzystorem T3 </w:t>
+      </w:r>
+      <w:r>
+        <w:rPr>
+          <w:rStyle w:val="ac"/>
+          <w:rFonts w:ascii="Calibri" w:hAnsi="Calibri" w:cs="Calibri"/>
+        </w:rPr>
+        <w:t xml:space="preserve">było </w:t>
+      </w:r>
+      <w:r>
+        <w:rPr>
+          <w:rStyle w:val="ac"/>
+          <w:rFonts w:ascii="Calibri" w:hAnsi="Calibri" w:cs="Calibri"/>
+        </w:rPr>
+        <w:t>zbyt wolne sterowanie pojemnością bramki</w:t>
       </w:r>
       <w:r>
         <w:rPr>
@@ -6528,7 +6861,6 @@
           <w:tab w:val="left" w:pos="288"/>
         </w:tabs>
         <w:spacing w:before="56" w:after="56"/>
-        <w:jc w:val="both"/>
         <w:rPr>
           <w:rFonts w:ascii="Calibri" w:hAnsi="Calibri" w:cs="Calibri"/>
           <w:b/>
@@ -6543,12 +6875,6 @@
         <w:tabs>
           <w:tab w:val="left" w:pos="288"/>
         </w:tabs>
-        <w:jc w:val="both"/>
-        <w:rPr>
-          <w:rFonts w:ascii="Calibri" w:hAnsi="Calibri" w:cs="Calibri"/>
-        </w:rPr>
-      </w:pPr>
-      <w:r>
         <w:rPr>
           <w:rFonts w:ascii="Calibri" w:hAnsi="Calibri" w:cs="Calibri"/>
           <w:b/>
@@ -6556,6 +6882,26 @@
           <w:color w:val="000000"/>
           <w:lang w:bidi="ar-SA"/>
         </w:rPr>
+      </w:pPr>
+    </w:p>
+    <w:p>
+      <w:pPr>
+        <w:tabs>
+          <w:tab w:val="left" w:pos="288"/>
+        </w:tabs>
+        <w:rPr>
+          <w:rFonts w:ascii="Calibri" w:hAnsi="Calibri" w:cs="Calibri"/>
+        </w:rPr>
+      </w:pPr>
+      <w:r>
+        <w:rPr>
+          <w:rFonts w:ascii="Calibri" w:hAnsi="Calibri" w:cs="Calibri"/>
+          <w:b/>
+          <w:bCs/>
+          <w:color w:val="000000"/>
+          <w:lang w:bidi="ar-SA"/>
+        </w:rPr>
+        <w:lastRenderedPageBreak/>
         <w:t>C.</w:t>
       </w:r>
       <w:r>
@@ -6592,7 +6938,6 @@
         <w:tabs>
           <w:tab w:val="left" w:pos="288"/>
         </w:tabs>
-        <w:jc w:val="both"/>
         <w:rPr>
           <w:color w:val="000000"/>
           <w:lang w:bidi="ar-SA"/>
@@ -6604,17 +6949,9 @@
           <w:lang w:val="ru-RU" w:eastAsia="ru-RU" w:bidi="ar-SA"/>
         </w:rPr>
         <w:drawing>
-          <wp:anchor distT="0" distB="0" distL="0" distR="0" simplePos="0" relativeHeight="251666432" behindDoc="0" locked="0" layoutInCell="0" allowOverlap="1" wp14:anchorId="2352246C" wp14:editId="214C1775">
-            <wp:simplePos x="0" y="0"/>
-            <wp:positionH relativeFrom="margin">
-              <wp:align>left</wp:align>
-            </wp:positionH>
-            <wp:positionV relativeFrom="paragraph">
-              <wp:posOffset>184785</wp:posOffset>
-            </wp:positionV>
-            <wp:extent cx="3075305" cy="1801495"/>
-            <wp:effectExtent l="0" t="0" r="0" b="8255"/>
-            <wp:wrapSquare wrapText="largest"/>
+          <wp:inline distT="0" distB="0" distL="0" distR="0">
+            <wp:extent cx="3043870" cy="1783080"/>
+            <wp:effectExtent l="0" t="0" r="4445" b="7620"/>
             <wp:docPr id="14" name="Obraz14"/>
             <wp:cNvGraphicFramePr>
               <a:graphicFrameLocks xmlns:a="http://schemas.openxmlformats.org/drawingml/2006/main" noChangeAspect="1"/>
@@ -6629,7 +6966,13 @@
                     </pic:cNvPicPr>
                   </pic:nvPicPr>
                   <pic:blipFill>
-                    <a:blip r:embed="rId19"/>
+                    <a:blip r:embed="rId20" cstate="print">
+                      <a:extLst>
+                        <a:ext uri="{28A0092B-C50C-407E-A947-70E740481C1C}">
+                          <a14:useLocalDpi xmlns:a14="http://schemas.microsoft.com/office/drawing/2010/main" val="0"/>
+                        </a:ext>
+                      </a:extLst>
+                    </a:blip>
                     <a:stretch>
                       <a:fillRect/>
                     </a:stretch>
@@ -6637,7 +6980,7 @@
                   <pic:spPr bwMode="auto">
                     <a:xfrm>
                       <a:off x="0" y="0"/>
-                      <a:ext cx="3075305" cy="1801495"/>
+                      <a:ext cx="3045361" cy="1783954"/>
                     </a:xfrm>
                     <a:prstGeom prst="rect">
                       <a:avLst/>
@@ -6647,13 +6990,7 @@
                 </pic:pic>
               </a:graphicData>
             </a:graphic>
-            <wp14:sizeRelH relativeFrom="margin">
-              <wp14:pctWidth>0</wp14:pctWidth>
-            </wp14:sizeRelH>
-            <wp14:sizeRelV relativeFrom="margin">
-              <wp14:pctHeight>0</wp14:pctHeight>
-            </wp14:sizeRelV>
-          </wp:anchor>
+          </wp:inline>
         </w:drawing>
       </w:r>
       <w:r>
@@ -6663,17 +7000,9 @@
           <w:lang w:val="ru-RU" w:eastAsia="ru-RU" w:bidi="ar-SA"/>
         </w:rPr>
         <w:drawing>
-          <wp:anchor distT="0" distB="0" distL="0" distR="0" simplePos="0" relativeHeight="251667456" behindDoc="0" locked="0" layoutInCell="0" allowOverlap="1" wp14:anchorId="7F2C9D45" wp14:editId="6D9A61FD">
-            <wp:simplePos x="0" y="0"/>
-            <wp:positionH relativeFrom="margin">
-              <wp:posOffset>3080385</wp:posOffset>
-            </wp:positionH>
-            <wp:positionV relativeFrom="paragraph">
-              <wp:posOffset>196850</wp:posOffset>
-            </wp:positionV>
+          <wp:inline distT="0" distB="0" distL="0" distR="0">
             <wp:extent cx="3039110" cy="1779905"/>
             <wp:effectExtent l="0" t="0" r="8890" b="0"/>
-            <wp:wrapSquare wrapText="largest"/>
             <wp:docPr id="15" name="Obraz15"/>
             <wp:cNvGraphicFramePr>
               <a:graphicFrameLocks xmlns:a="http://schemas.openxmlformats.org/drawingml/2006/main" noChangeAspect="1"/>
@@ -6688,7 +7017,13 @@
                     </pic:cNvPicPr>
                   </pic:nvPicPr>
                   <pic:blipFill>
-                    <a:blip r:embed="rId20"/>
+                    <a:blip r:embed="rId21" cstate="print">
+                      <a:extLst>
+                        <a:ext uri="{28A0092B-C50C-407E-A947-70E740481C1C}">
+                          <a14:useLocalDpi xmlns:a14="http://schemas.microsoft.com/office/drawing/2010/main" val="0"/>
+                        </a:ext>
+                      </a:extLst>
+                    </a:blip>
                     <a:stretch>
                       <a:fillRect/>
                     </a:stretch>
@@ -6706,13 +7041,7 @@
                 </pic:pic>
               </a:graphicData>
             </a:graphic>
-            <wp14:sizeRelH relativeFrom="margin">
-              <wp14:pctWidth>0</wp14:pctWidth>
-            </wp14:sizeRelH>
-            <wp14:sizeRelV relativeFrom="margin">
-              <wp14:pctHeight>0</wp14:pctHeight>
-            </wp14:sizeRelV>
-          </wp:anchor>
+          </wp:inline>
         </w:drawing>
       </w:r>
     </w:p>
@@ -6721,23 +7050,31 @@
         <w:tabs>
           <w:tab w:val="left" w:pos="288"/>
         </w:tabs>
-        <w:jc w:val="both"/>
+        <w:rPr>
+          <w:rFonts w:ascii="Calibri" w:hAnsi="Calibri"/>
+        </w:rPr>
+      </w:pPr>
+      <w:r>
         <w:rPr>
           <w:color w:val="000000"/>
           <w:lang w:bidi="ar-SA"/>
         </w:rPr>
-      </w:pPr>
-    </w:p>
-    <w:p>
-      <w:pPr>
-        <w:tabs>
-          <w:tab w:val="left" w:pos="288"/>
-        </w:tabs>
-        <w:jc w:val="center"/>
-        <w:rPr>
-          <w:rFonts w:ascii="Calibri" w:hAnsi="Calibri"/>
-        </w:rPr>
-      </w:pPr>
+        <w:t xml:space="preserve">                   Ry</w:t>
+      </w:r>
+      <w:r>
+        <w:rPr>
+          <w:color w:val="000000"/>
+          <w:lang w:bidi="ar-SA"/>
+        </w:rPr>
+        <w:t>s. 2.5</w:t>
+      </w:r>
+      <w:r>
+        <w:rPr>
+          <w:color w:val="000000"/>
+          <w:lang w:bidi="ar-SA"/>
+        </w:rPr>
+        <w:t xml:space="preserve">. </w:t>
+      </w:r>
       <m:oMath>
         <m:sSub>
           <m:sSubPr>
@@ -6824,7 +7161,25 @@
         <w:rPr>
           <w:rFonts w:ascii="Calibri" w:hAnsi="Calibri"/>
         </w:rPr>
-        <w:t xml:space="preserve">                                 </w:t>
+        <w:t xml:space="preserve">       </w:t>
+      </w:r>
+      <w:r>
+        <w:rPr>
+          <w:rFonts w:ascii="Calibri" w:hAnsi="Calibri"/>
+        </w:rPr>
+        <w:t xml:space="preserve">   </w:t>
+      </w:r>
+      <w:r>
+        <w:rPr>
+          <w:rFonts w:ascii="Calibri" w:hAnsi="Calibri"/>
+        </w:rPr>
+        <w:t>Rys. 2.6</w:t>
+      </w:r>
+      <w:r>
+        <w:rPr>
+          <w:rFonts w:ascii="Calibri" w:hAnsi="Calibri"/>
+        </w:rPr>
+        <w:t xml:space="preserve">  </w:t>
       </w:r>
       <m:oMath>
         <m:sSub>
@@ -6890,20 +7245,41 @@
         <w:tabs>
           <w:tab w:val="left" w:pos="288"/>
         </w:tabs>
-        <w:jc w:val="both"/>
-        <w:rPr>
-          <w:rFonts w:ascii="Calibri" w:hAnsi="Calibri"/>
-          <w:color w:val="000000"/>
-          <w:lang w:bidi="ar-SA"/>
-        </w:rPr>
-      </w:pPr>
+        <w:jc w:val="center"/>
+        <w:rPr>
+          <w:rFonts w:ascii="Calibri" w:hAnsi="Calibri"/>
+        </w:rPr>
+      </w:pPr>
+      <w:r>
+        <w:rPr>
+          <w:rFonts w:ascii="Calibri" w:hAnsi="Calibri"/>
+        </w:rPr>
+        <w:t>CH1 – sygnał z generatora, CH2 – napię</w:t>
+      </w:r>
+      <w:r>
+        <w:rPr>
+          <w:rFonts w:ascii="Calibri" w:hAnsi="Calibri"/>
+        </w:rPr>
+        <w:t>cie na kolektorze tranzystora T4</w:t>
+      </w:r>
     </w:p>
     <w:p>
       <w:pPr>
         <w:tabs>
           <w:tab w:val="left" w:pos="288"/>
         </w:tabs>
-        <w:jc w:val="both"/>
+        <w:rPr>
+          <w:rFonts w:ascii="Calibri" w:hAnsi="Calibri"/>
+          <w:color w:val="000000"/>
+          <w:lang w:bidi="ar-SA"/>
+        </w:rPr>
+      </w:pPr>
+    </w:p>
+    <w:p>
+      <w:pPr>
+        <w:tabs>
+          <w:tab w:val="left" w:pos="288"/>
+        </w:tabs>
         <w:rPr>
           <w:rFonts w:ascii="Calibri" w:hAnsi="Calibri" w:cs="Calibri"/>
         </w:rPr>
@@ -6997,19 +7373,19 @@
         <w:rPr>
           <w:rFonts w:ascii="Calibri" w:hAnsi="Calibri" w:cs="Calibri"/>
         </w:rPr>
-        <w:t xml:space="preserve"> praktycznie nie otwierał się w stopniu wystarczającym do poprawnej pracy klucza: napięcie na drenie nie przełączało się prawidłowo między dwoma skrajnymi poziomami, a prąd diody był zbyt mały, by układ działał tak jak wcześniej. Taki wynik jest zgodny z ogólną zasadą, że </w:t>
-      </w:r>
-      <w:r>
-        <w:rPr>
-          <w:rFonts w:ascii="Calibri" w:hAnsi="Calibri" w:cs="Calibri"/>
-        </w:rPr>
-        <w:t>napięcie progowe oznacza jedynie początek tworzenia kanału, a nie warunek poprawnej pracy jako klucz o małej rezystancji w stanie włączenia</w:t>
-      </w:r>
-      <w:r>
-        <w:rPr>
-          <w:rFonts w:ascii="Calibri" w:hAnsi="Calibri" w:cs="Calibri"/>
-        </w:rPr>
-        <w:t>.</w:t>
+        <w:t xml:space="preserve"> </w:t>
+      </w:r>
+      <w:r>
+        <w:rPr>
+          <w:rFonts w:ascii="Calibri" w:hAnsi="Calibri" w:cs="Calibri"/>
+        </w:rPr>
+        <w:t>okazał się w stanie wyłączenia</w:t>
+      </w:r>
+      <w:r>
+        <w:rPr>
+          <w:rFonts w:ascii="Calibri" w:hAnsi="Calibri" w:cs="Calibri"/>
+        </w:rPr>
+        <w:t xml:space="preserve">. </w:t>
       </w:r>
     </w:p>
     <w:p>
@@ -7017,7 +7393,6 @@
         <w:tabs>
           <w:tab w:val="left" w:pos="288"/>
         </w:tabs>
-        <w:jc w:val="both"/>
         <w:rPr>
           <w:rFonts w:ascii="Calibri" w:hAnsi="Calibri" w:cs="Calibri"/>
         </w:rPr>
@@ -7028,7 +7403,6 @@
         <w:tabs>
           <w:tab w:val="left" w:pos="288"/>
         </w:tabs>
-        <w:jc w:val="both"/>
         <w:rPr>
           <w:rFonts w:ascii="Calibri" w:hAnsi="Calibri" w:cs="Calibri"/>
         </w:rPr>
@@ -7083,7 +7457,13 @@
         <w:rPr>
           <w:rFonts w:ascii="Calibri" w:hAnsi="Calibri" w:cs="Calibri"/>
         </w:rPr>
-        <w:t xml:space="preserve"> działanie układu istotnie się poprawiło: tranzystor zaczął się wyraźnie przełączać, a napięcie na drenie zmieniało się w dużo większym zakresie</w:t>
+        <w:t xml:space="preserve"> </w:t>
+      </w:r>
+      <w:r>
+        <w:rPr>
+          <w:rFonts w:ascii="Calibri" w:hAnsi="Calibri" w:cs="Calibri"/>
+        </w:rPr>
+        <w:t>tranzystor okazał się w stanie nasycenia</w:t>
       </w:r>
       <w:r>
         <w:rPr>
@@ -7134,7 +7514,13 @@
         <w:rPr>
           <w:rFonts w:ascii="Calibri" w:hAnsi="Calibri" w:cs="Calibri"/>
         </w:rPr>
-        <w:t xml:space="preserve"> do 5 V poprawiło pracę układu w warunkach laboratoryjnych, ale w praktyce taki zabieg nie zawsze jest możliwy. Dlatego dobór tranzystora musi uwzględniać napięcie sterujące dostępne w rzeczywistym układzie</w:t>
+        <w:t xml:space="preserve"> do 5 V umożliwiło</w:t>
+      </w:r>
+      <w:r>
+        <w:rPr>
+          <w:rFonts w:ascii="Calibri" w:hAnsi="Calibri" w:cs="Calibri"/>
+        </w:rPr>
+        <w:t xml:space="preserve"> pracę układu w warunkach laboratoryjnych, ale w praktyce taki zabieg nie zawsze jest możliwy. Dlatego dobór tranzystora musi uwzględniać napięcie sterujące dostępne w rzeczywistym układzie</w:t>
       </w:r>
       <w:r>
         <w:rPr>
@@ -7146,7 +7532,19 @@
         <w:rPr>
           <w:rFonts w:ascii="Calibri" w:hAnsi="Calibri" w:cs="Calibri"/>
         </w:rPr>
-        <w:t xml:space="preserve"> Nie oznacza to jednak, że T4 jest równie wygodny w sterowaniu jak T3. Z instrukcji wynika, że T4 jest tranzystorem </w:t>
+        <w:t xml:space="preserve"> Nie oznacza to jednak, że T4 jest równie wygodny w sterow</w:t>
+      </w:r>
+      <w:r>
+        <w:rPr>
+          <w:rFonts w:ascii="Calibri" w:hAnsi="Calibri" w:cs="Calibri"/>
+        </w:rPr>
+        <w:t>aniu jak T3. Z datasheet-u wynika</w:t>
+      </w:r>
+      <w:r>
+        <w:rPr>
+          <w:rFonts w:ascii="Calibri" w:hAnsi="Calibri" w:cs="Calibri"/>
+        </w:rPr>
+        <w:t xml:space="preserve">, że T4 jest tranzystorem </w:t>
       </w:r>
       <w:r>
         <w:rPr>
@@ -7167,7 +7565,20 @@
         <w:rPr>
           <w:rFonts w:ascii="Calibri" w:hAnsi="Calibri" w:cs="Calibri"/>
         </w:rPr>
-        <w:t xml:space="preserve"> a w materiałach teoretycznych podkreślono, że duże MOSFET-y mają zwykle większą pojemność wejściową i mogą wymagać silniejszego sterowania bramki. To dobrze tłumaczy, dlaczego tranzystor, który „jest MOSFET-em”, nie musi dobrze działać przy małej amplitudzie sygnału logicznego.</w:t>
+        <w:t xml:space="preserve"> a </w:t>
+      </w:r>
+      <w:r>
+        <w:rPr>
+          <w:rFonts w:ascii="Calibri" w:hAnsi="Calibri" w:cs="Calibri"/>
+          <w:color w:val="FFC000"/>
+        </w:rPr>
+        <w:t xml:space="preserve">w materiałach teoretycznych podkreślono, że </w:t>
+      </w:r>
+      <w:r>
+        <w:rPr>
+          <w:rFonts w:ascii="Calibri" w:hAnsi="Calibri" w:cs="Calibri"/>
+        </w:rPr>
+        <w:t xml:space="preserve">duże MOSFET-y mają zwykle większą pojemność wejściową i mogą wymagać silniejszego sterowania bramki. </w:t>
       </w:r>
     </w:p>
     <w:p>
@@ -7175,7 +7586,6 @@
         <w:tabs>
           <w:tab w:val="left" w:pos="288"/>
         </w:tabs>
-        <w:jc w:val="both"/>
         <w:rPr>
           <w:rFonts w:ascii="Calibri" w:hAnsi="Calibri" w:cs="Calibri"/>
         </w:rPr>
@@ -7186,10 +7596,9 @@
         <w:tabs>
           <w:tab w:val="left" w:pos="288"/>
         </w:tabs>
-        <w:jc w:val="both"/>
-        <w:rPr>
-          <w:rFonts w:ascii="Calibri" w:hAnsi="Calibri" w:cs="Calibri"/>
-          <w:color w:val="000000"/>
+        <w:rPr>
+          <w:rFonts w:ascii="Calibri" w:hAnsi="Calibri" w:cs="Calibri"/>
+          <w:color w:val="FFC000"/>
           <w:lang w:bidi="ar-SA"/>
         </w:rPr>
       </w:pPr>
@@ -7311,7 +7720,6 @@
         <w:tabs>
           <w:tab w:val="left" w:pos="288"/>
         </w:tabs>
-        <w:jc w:val="both"/>
         <w:rPr>
           <w:rFonts w:ascii="Calibri" w:hAnsi="Calibri"/>
           <w:color w:val="000000"/>
@@ -7325,7 +7733,6 @@
         <w:tabs>
           <w:tab w:val="left" w:pos="288"/>
         </w:tabs>
-        <w:jc w:val="both"/>
         <w:rPr>
           <w:rFonts w:ascii="Calibri" w:hAnsi="Calibri"/>
           <w:color w:val="000000"/>
@@ -7340,7 +7747,6 @@
         <w:tabs>
           <w:tab w:val="left" w:pos="288"/>
         </w:tabs>
-        <w:jc w:val="both"/>
         <w:rPr>
           <w:rFonts w:ascii="Calibri" w:hAnsi="Calibri"/>
         </w:rPr>
@@ -7373,7 +7779,6 @@
         <w:tabs>
           <w:tab w:val="left" w:pos="288"/>
         </w:tabs>
-        <w:jc w:val="both"/>
         <w:rPr>
           <w:rFonts w:ascii="Calibri" w:hAnsi="Calibri"/>
           <w:color w:val="000000"/>
@@ -7386,41 +7791,67 @@
         <w:tabs>
           <w:tab w:val="left" w:pos="288"/>
         </w:tabs>
-        <w:jc w:val="both"/>
-        <w:rPr>
-          <w:rFonts w:ascii="Calibri" w:hAnsi="Calibri"/>
-        </w:rPr>
-      </w:pPr>
-      <w:r>
-        <w:rPr>
-          <w:rFonts w:ascii="Calibri" w:hAnsi="Calibri"/>
-          <w:i/>
-          <w:iCs/>
-          <w:color w:val="FF0000"/>
+        <w:rPr>
+          <w:rFonts w:ascii="Calibri" w:hAnsi="Calibri" w:cs="Calibri"/>
+        </w:rPr>
+      </w:pPr>
+      <w:r>
+        <w:rPr>
+          <w:rFonts w:ascii="Calibri" w:hAnsi="Calibri"/>
+          <w:color w:val="000000"/>
           <w:lang w:bidi="ar-SA"/>
         </w:rPr>
-        <w:t xml:space="preserve">(tu podsumuj WSZYSTKIE dotychczas zebrane doświadczenia i wyciągnij z nich </w:t>
-      </w:r>
-      <w:r>
-        <w:rPr>
-          <w:rFonts w:ascii="Calibri" w:hAnsi="Calibri"/>
-          <w:i/>
-          <w:iCs/>
-          <w:color w:val="FF0000"/>
-          <w:u w:val="single"/>
+        <w:t>W przypadku potrzeby projektowania</w:t>
+      </w:r>
+      <w:r>
+        <w:rPr>
+          <w:rFonts w:ascii="Calibri" w:hAnsi="Calibri"/>
+          <w:color w:val="000000"/>
           <w:lang w:bidi="ar-SA"/>
         </w:rPr>
-        <w:t>wnioski</w:t>
-      </w:r>
-      <w:r>
-        <w:rPr>
-          <w:rFonts w:ascii="Calibri" w:hAnsi="Calibri"/>
-          <w:i/>
-          <w:iCs/>
-          <w:color w:val="FF0000"/>
+        <w:t xml:space="preserve"> </w:t>
+      </w:r>
+      <w:r>
+        <w:rPr>
+          <w:rFonts w:ascii="Calibri" w:hAnsi="Calibri" w:cs="Calibri"/>
+          <w:color w:val="000000"/>
           <w:lang w:bidi="ar-SA"/>
         </w:rPr>
-        <w:t>. Nie OPISUJ ponownie tego, co już wcześniej zostało opisanie i udokumentowanie)</w:t>
+        <w:t>klucz</w:t>
+      </w:r>
+      <w:r>
+        <w:rPr>
+          <w:rFonts w:ascii="Calibri" w:hAnsi="Calibri" w:cs="Calibri"/>
+          <w:color w:val="000000"/>
+          <w:lang w:bidi="ar-SA"/>
+        </w:rPr>
+        <w:t>a</w:t>
+      </w:r>
+      <w:r>
+        <w:rPr>
+          <w:rFonts w:ascii="Calibri" w:hAnsi="Calibri" w:cs="Calibri"/>
+          <w:color w:val="000000"/>
+          <w:lang w:bidi="ar-SA"/>
+        </w:rPr>
+        <w:t xml:space="preserve"> </w:t>
+      </w:r>
+      <w:r>
+        <w:rPr>
+          <w:rFonts w:ascii="Calibri" w:hAnsi="Calibri" w:cs="Calibri"/>
+        </w:rPr>
+        <w:t>tranzystorowego</w:t>
+      </w:r>
+      <w:r>
+        <w:rPr>
+          <w:rFonts w:ascii="Calibri" w:hAnsi="Calibri" w:cs="Calibri"/>
+        </w:rPr>
+        <w:t xml:space="preserve"> trze</w:t>
+      </w:r>
+      <w:r>
+        <w:rPr>
+          <w:rFonts w:ascii="Calibri" w:hAnsi="Calibri" w:cs="Calibri"/>
+        </w:rPr>
+        <w:t>ba rozważyć na jakim tranzystorze będziemy to robili. To zależy od wymagań projektowych:</w:t>
       </w:r>
     </w:p>
     <w:p>
@@ -7428,32 +7859,15 @@
         <w:tabs>
           <w:tab w:val="left" w:pos="288"/>
         </w:tabs>
-        <w:jc w:val="both"/>
-        <w:rPr>
-          <w:rFonts w:ascii="Calibri" w:hAnsi="Calibri"/>
-        </w:rPr>
-      </w:pPr>
-      <w:r>
-        <w:rPr>
-          <w:rFonts w:ascii="Calibri" w:hAnsi="Calibri"/>
-          <w:b/>
-          <w:bCs/>
-          <w:color w:val="000000"/>
-          <w:sz w:val="28"/>
-          <w:szCs w:val="28"/>
-          <w:lang w:bidi="ar-SA"/>
-        </w:rPr>
-        <w:t>3.</w:t>
-      </w:r>
-      <w:r>
-        <w:rPr>
-          <w:rFonts w:ascii="Calibri" w:hAnsi="Calibri"/>
-          <w:b/>
-          <w:bCs/>
-          <w:color w:val="000000"/>
-          <w:lang w:bidi="ar-SA"/>
-        </w:rPr>
-        <w:t xml:space="preserve"> Podsumowanie</w:t>
+        <w:rPr>
+          <w:rFonts w:ascii="Calibri" w:hAnsi="Calibri" w:cs="Calibri"/>
+        </w:rPr>
+      </w:pPr>
+      <w:r>
+        <w:rPr>
+          <w:rFonts w:ascii="Calibri" w:hAnsi="Calibri" w:cs="Calibri"/>
+        </w:rPr>
+        <w:t>BJT:</w:t>
       </w:r>
     </w:p>
     <w:p>
@@ -7461,55 +7875,56 @@
         <w:tabs>
           <w:tab w:val="left" w:pos="288"/>
         </w:tabs>
-        <w:jc w:val="both"/>
-        <w:rPr>
-          <w:rFonts w:ascii="Calibri" w:hAnsi="Calibri"/>
-          <w:color w:val="000000"/>
-          <w:lang w:bidi="ar-SA"/>
-        </w:rPr>
-      </w:pPr>
+        <w:rPr>
+          <w:rFonts w:ascii="Calibri" w:hAnsi="Calibri" w:cs="Calibri"/>
+        </w:rPr>
+      </w:pPr>
+      <w:r>
+        <w:rPr>
+          <w:rFonts w:ascii="Calibri" w:hAnsi="Calibri" w:cs="Calibri"/>
+        </w:rPr>
+        <w:t>Gdy prostota sterowania prądem jest ważniesza</w:t>
+      </w:r>
+      <w:r>
+        <w:rPr>
+          <w:rFonts w:ascii="Calibri" w:hAnsi="Calibri" w:cs="Calibri"/>
+        </w:rPr>
+        <w:t xml:space="preserve"> od minimalizacji stat bądź szybkiego przełaczania.</w:t>
+      </w:r>
     </w:p>
     <w:p>
       <w:pPr>
         <w:tabs>
           <w:tab w:val="left" w:pos="288"/>
         </w:tabs>
-        <w:jc w:val="both"/>
-        <w:rPr>
-          <w:rFonts w:ascii="Calibri" w:hAnsi="Calibri"/>
-        </w:rPr>
-      </w:pPr>
-      <w:r>
-        <w:rPr>
-          <w:rFonts w:ascii="Calibri" w:hAnsi="Calibri"/>
-          <w:i/>
-          <w:iCs/>
-          <w:color w:val="FF0000"/>
-          <w:lang w:bidi="ar-SA"/>
-        </w:rPr>
-        <w:t xml:space="preserve">(tu podsumuj WSZYSTKIE dotychczas zebrane doświadczenia i wyciągnij z nich </w:t>
-      </w:r>
-      <w:r>
-        <w:rPr>
-          <w:rFonts w:ascii="Calibri" w:hAnsi="Calibri"/>
-          <w:i/>
-          <w:iCs/>
-          <w:color w:val="FF0000"/>
-          <w:u w:val="single"/>
-          <w:lang w:bidi="ar-SA"/>
-        </w:rPr>
-        <w:t>wnioski</w:t>
-      </w:r>
-      <w:r>
-        <w:rPr>
-          <w:rFonts w:ascii="Calibri" w:hAnsi="Calibri"/>
-          <w:i/>
-          <w:iCs/>
-          <w:color w:val="FF0000"/>
-          <w:lang w:bidi="ar-SA"/>
-        </w:rPr>
-        <w:t>. Nie OPISUJ ponownie tego, co już wcześniej zostało opisanie i udokumentowanie)</w:t>
-      </w:r>
+        <w:rPr>
+          <w:rFonts w:ascii="Calibri" w:hAnsi="Calibri" w:cs="Calibri"/>
+        </w:rPr>
+      </w:pPr>
+      <w:r>
+        <w:rPr>
+          <w:rFonts w:ascii="Calibri" w:hAnsi="Calibri" w:cs="Calibri"/>
+        </w:rPr>
+        <w:t>Przy projektowaniu takich układów trzeba zwracać uwagę na wartość prądu bazy była 2-3 krotnie większa od minimalnej, oraz należy pamiętać o możliwości przyspieszenia klucza poprzez zastosowania pojemności w obwodzie bazy</w:t>
+      </w:r>
+    </w:p>
+    <w:p>
+      <w:pPr>
+        <w:tabs>
+          <w:tab w:val="left" w:pos="288"/>
+        </w:tabs>
+        <w:rPr>
+          <w:rFonts w:ascii="Calibri" w:hAnsi="Calibri" w:cs="Calibri"/>
+        </w:rPr>
+      </w:pPr>
+      <w:r>
+        <w:rPr>
+          <w:rFonts w:ascii="Calibri" w:hAnsi="Calibri" w:cs="Calibri"/>
+        </w:rPr>
+        <w:t>MOSFET:</w:t>
+      </w:r>
+      <w:bookmarkStart w:id="0" w:name="_GoBack"/>
+      <w:bookmarkEnd w:id="0"/>
     </w:p>
     <w:sectPr>
       <w:pgSz w:w="11906" w:h="16838"/>
@@ -7534,7 +7949,7 @@
       <w:lvlText w:val="%1."/>
       <w:lvlJc w:val="left"/>
       <w:pPr>
-        <w:ind w:left="720" w:hanging="360"/>
+        <w:ind w:left="450" w:hanging="360"/>
       </w:pPr>
       <w:rPr>
         <w:rFonts w:hint="default"/>

</xml_diff>